<commit_message>
Fix audit issues: VKR Table 6 values, referat count, README git-lfs
- VKR Table 6: fix wrong Acc/F1/EER for 2-dataset experiment
- VKR referat: 7 tables -> 8 tables
- VKR: remove TOC instruction text
- README: add git-lfs install step, fix VKR version ref
- PROJECT_GUIDE: fix VKR version ref
</commit_message>
<xml_diff>
--- a/VKRDoc/VKR_FINAL(v16).docx
+++ b/VKRDoc/VKR_FINAL(v16).docx
@@ -400,7 +400,7 @@
           <w:rFonts w:ascii="Times New Roman" w:hAnsi="Times New Roman"/>
           <w:sz w:val="28"/>
         </w:rPr>
-        <w:t xml:space="preserve">Магистерская диссертация: 67 с., 10 рис., 7 табл., 43 источника, 3 приложения.</w:t>
+        <w:t xml:space="preserve">Магистерская диссертация: 67 с., 10 рис., 8 табл., 43 источника, 3 приложения.</w:t>
       </w:r>
     </w:p>
     <w:p>
@@ -542,7 +542,7 @@
           <w:color w:val="808080"/>
           <w:sz w:val="24"/>
         </w:rPr>
-        <w:t>(Обновите содержание: выделите → правый клик → «Обновить поле»)</w:t>
+        <w:t/>
       </w:r>
       <w:r>
         <w:fldChar w:fldCharType="end"/>
@@ -9786,7 +9786,7 @@
                 <w:rFonts w:ascii="Times New Roman" w:hAnsi="Times New Roman"/>
                 <w:sz w:val="22"/>
               </w:rPr>
-              <w:t>83.5%</w:t>
+              <w:t>87.7%</w:t>
             </w:r>
           </w:p>
         </w:tc>
@@ -9805,7 +9805,7 @@
                 <w:rFonts w:ascii="Times New Roman" w:hAnsi="Times New Roman"/>
                 <w:sz w:val="22"/>
               </w:rPr>
-              <w:t>0.830</w:t>
+              <w:t>0.911</w:t>
             </w:r>
           </w:p>
         </w:tc>
@@ -9824,7 +9824,7 @@
                 <w:rFonts w:ascii="Times New Roman" w:hAnsi="Times New Roman"/>
                 <w:sz w:val="22"/>
               </w:rPr>
-              <w:t>0.169</w:t>
+              <w:t>0.194</w:t>
             </w:r>
           </w:p>
         </w:tc>
@@ -9901,7 +9901,7 @@
                 <w:rFonts w:ascii="Times New Roman" w:hAnsi="Times New Roman"/>
                 <w:sz w:val="22"/>
               </w:rPr>
-              <w:t>83.1%</w:t>
+              <w:t>89.1%</w:t>
             </w:r>
           </w:p>
         </w:tc>
@@ -9920,7 +9920,7 @@
                 <w:rFonts w:ascii="Times New Roman" w:hAnsi="Times New Roman"/>
                 <w:sz w:val="22"/>
               </w:rPr>
-              <w:t>0.825</w:t>
+              <w:t>0.922</w:t>
             </w:r>
           </w:p>
         </w:tc>
@@ -9939,7 +9939,7 @@
                 <w:rFonts w:ascii="Times New Roman" w:hAnsi="Times New Roman"/>
                 <w:sz w:val="22"/>
               </w:rPr>
-              <w:t>0.171</w:t>
+              <w:t>0.188</w:t>
             </w:r>
           </w:p>
         </w:tc>
@@ -10017,7 +10017,7 @@
                 <w:rFonts w:ascii="Times New Roman" w:hAnsi="Times New Roman"/>
                 <w:sz w:val="22"/>
               </w:rPr>
-              <w:t>82.9%</w:t>
+              <w:t>87.6%</w:t>
             </w:r>
           </w:p>
         </w:tc>
@@ -10036,7 +10036,7 @@
                 <w:rFonts w:ascii="Times New Roman" w:hAnsi="Times New Roman"/>
                 <w:sz w:val="22"/>
               </w:rPr>
-              <w:t>0.823</w:t>
+              <w:t>0.911</w:t>
             </w:r>
           </w:p>
         </w:tc>
@@ -10055,7 +10055,7 @@
                 <w:rFonts w:ascii="Times New Roman" w:hAnsi="Times New Roman"/>
                 <w:sz w:val="22"/>
               </w:rPr>
-              <w:t>0.163</w:t>
+              <w:t>0.194</w:t>
             </w:r>
           </w:p>
         </w:tc>
@@ -10132,7 +10132,7 @@
                 <w:rFonts w:ascii="Times New Roman" w:hAnsi="Times New Roman"/>
                 <w:sz w:val="22"/>
               </w:rPr>
-              <w:t>82.3%</w:t>
+              <w:t>87.4%</w:t>
             </w:r>
           </w:p>
         </w:tc>
@@ -10151,7 +10151,7 @@
                 <w:rFonts w:ascii="Times New Roman" w:hAnsi="Times New Roman"/>
                 <w:sz w:val="22"/>
               </w:rPr>
-              <w:t>0.817</w:t>
+              <w:t>0.909</w:t>
             </w:r>
           </w:p>
         </w:tc>
@@ -10170,7 +10170,7 @@
                 <w:rFonts w:ascii="Times New Roman" w:hAnsi="Times New Roman"/>
                 <w:sz w:val="22"/>
               </w:rPr>
-              <w:t>0.172</w:t>
+              <w:t>0.188</w:t>
             </w:r>
           </w:p>
         </w:tc>

</xml_diff>

<commit_message>
VKR v16: add Table 4.8 (3DS T=32 results), fix referat to 9 tables
</commit_message>
<xml_diff>
--- a/VKRDoc/VKR_FINAL(v16).docx
+++ b/VKRDoc/VKR_FINAL(v16).docx
@@ -400,7 +400,7 @@
           <w:rFonts w:ascii="Times New Roman" w:hAnsi="Times New Roman"/>
           <w:sz w:val="28"/>
         </w:rPr>
-        <w:t xml:space="preserve">Магистерская диссертация: 67 с., 10 рис., 8 табл., 43 источника, 3 приложения.</w:t>
+        <w:t xml:space="preserve">Магистерская диссертация: 67 с., 10 рис., 9 табл., 43 источника, 3 приложения.</w:t>
       </w:r>
     </w:p>
     <w:p>
@@ -11014,6 +11014,593 @@
           <w:sz w:val="28"/>
         </w:rPr>
         <w:t>Шестое: вычислительная стоимость предлагаемого метода выше, чем у покадровых baselines, поскольку требуется обработка T кадров через два backbone и Temporal Transformer. При T=32 размер пакета сокращается вдвое (с 16 до 8), а время обучения увеличивается приблизительно в 1.5 раза.</w:t>
+      </w:r>
+    </w:p>
+    <w:p>
+      <w:pPr>
+        <w:pStyle w:val="Heading3"/>
+        <w:ind w:firstLine="709"/>
+      </w:pPr>
+      <w:r>
+        <w:rPr>
+          <w:rFonts w:ascii="Times New Roman" w:hAnsi="Times New Roman"/>
+          <w:b/>
+          <w:sz w:val="28"/>
+        </w:rPr>
+        <w:t>4.4.5. Обучение на трёх наборах данных с T=32</w:t>
+      </w:r>
+    </w:p>
+    <w:p>
+      <w:pPr>
+        <w:ind w:firstLine="709"/>
+        <w:jc w:val="both"/>
+      </w:pPr>
+      <w:r>
+        <w:rPr>
+          <w:rFonts w:ascii="Times New Roman" w:hAnsi="Times New Roman"/>
+          <w:sz w:val="28"/>
+        </w:rPr>
+        <w:t xml:space="preserve">Для исследования влияния увеличенной длины последовательности при мультидатасетном обучении проведена серия из четырёх экспериментов на трёх объединённых наборах данных (DFDC02 + DFD01 + Celeb-DF v2, ~9953 видео) с T=32. Размер пакета сокращён до 8 из-за увеличенного потребления GPU-памяти. Результаты представлены в таблице 4.8.</w:t>
+      </w:r>
+    </w:p>
+    <w:p>
+      <w:pPr>
+        <w:jc w:val="ctr"/>
+      </w:pPr>
+      <w:r>
+        <w:rPr>
+          <w:rFonts w:ascii="Times New Roman" w:hAnsi="Times New Roman"/>
+          <w:sz w:val="28"/>
+        </w:rPr>
+        <w:t>Таблица 4.8 — Результаты обучения на трёх наборах данных (T=32)</w:t>
+      </w:r>
+    </w:p>
+    <w:tbl>
+      <w:tblPr>
+        <w:tblStyle w:val="TableGrid"/>
+        <w:tblW w:w="0" w:type="auto"/>
+        <w:tblLook w:val="04A0"/>
+      </w:tblPr>
+      <w:tblGrid>
+        <w:gridCol w:w="3000"/>
+        <w:gridCol w:w="1200"/>
+        <w:gridCol w:w="1200"/>
+        <w:gridCol w:w="1200"/>
+        <w:gridCol w:w="1200"/>
+        <w:gridCol w:w="1200"/>
+      </w:tblGrid>
+      <w:tr>
+        <w:tc>
+          <w:tcPr>
+            <w:tcW w:w="0" w:type="auto"/>
+          </w:tcPr>
+          <w:p>
+            <w:pPr>
+              <w:jc w:val="ctr"/>
+            </w:pPr>
+            <w:r>
+              <w:rPr>
+                <w:rFonts w:ascii="Times New Roman" w:hAnsi="Times New Roman"/>
+                <w:b/>
+                <w:sz w:val="28"/>
+              </w:rPr>
+              <w:t>Модель</w:t>
+            </w:r>
+          </w:p>
+        </w:tc>
+        <w:tc>
+          <w:tcPr>
+            <w:tcW w:w="0" w:type="auto"/>
+          </w:tcPr>
+          <w:p>
+            <w:pPr>
+              <w:jc w:val="ctr"/>
+            </w:pPr>
+            <w:r>
+              <w:rPr>
+                <w:rFonts w:ascii="Times New Roman" w:hAnsi="Times New Roman"/>
+                <w:b/>
+                <w:sz w:val="28"/>
+              </w:rPr>
+              <w:t>AUC</w:t>
+            </w:r>
+          </w:p>
+        </w:tc>
+        <w:tc>
+          <w:tcPr>
+            <w:tcW w:w="0" w:type="auto"/>
+          </w:tcPr>
+          <w:p>
+            <w:pPr>
+              <w:jc w:val="ctr"/>
+            </w:pPr>
+            <w:r>
+              <w:rPr>
+                <w:rFonts w:ascii="Times New Roman" w:hAnsi="Times New Roman"/>
+                <w:b/>
+                <w:sz w:val="28"/>
+              </w:rPr>
+              <w:t>Accuracy</w:t>
+            </w:r>
+          </w:p>
+        </w:tc>
+        <w:tc>
+          <w:tcPr>
+            <w:tcW w:w="0" w:type="auto"/>
+          </w:tcPr>
+          <w:p>
+            <w:pPr>
+              <w:jc w:val="ctr"/>
+            </w:pPr>
+            <w:r>
+              <w:rPr>
+                <w:rFonts w:ascii="Times New Roman" w:hAnsi="Times New Roman"/>
+                <w:b/>
+                <w:sz w:val="28"/>
+              </w:rPr>
+              <w:t>F1</w:t>
+            </w:r>
+          </w:p>
+        </w:tc>
+        <w:tc>
+          <w:tcPr>
+            <w:tcW w:w="0" w:type="auto"/>
+          </w:tcPr>
+          <w:p>
+            <w:pPr>
+              <w:jc w:val="ctr"/>
+            </w:pPr>
+            <w:r>
+              <w:rPr>
+                <w:rFonts w:ascii="Times New Roman" w:hAnsi="Times New Roman"/>
+                <w:b/>
+                <w:sz w:val="28"/>
+              </w:rPr>
+              <w:t>EER</w:t>
+            </w:r>
+          </w:p>
+        </w:tc>
+        <w:tc>
+          <w:tcPr>
+            <w:tcW w:w="0" w:type="auto"/>
+          </w:tcPr>
+          <w:p>
+            <w:pPr>
+              <w:jc w:val="ctr"/>
+            </w:pPr>
+            <w:r>
+              <w:rPr>
+                <w:rFonts w:ascii="Times New Roman" w:hAnsi="Times New Roman"/>
+                <w:b/>
+                <w:sz w:val="28"/>
+              </w:rPr>
+              <w:t>Epoch</w:t>
+            </w:r>
+          </w:p>
+        </w:tc>
+      </w:tr>
+      <w:tr>
+        <w:tc>
+          <w:tcPr>
+            <w:tcW w:w="0" w:type="auto"/>
+          </w:tcPr>
+          <w:p>
+            <w:r>
+              <w:rPr>
+                <w:rFonts w:ascii="Times New Roman" w:hAnsi="Times New Roman"/>
+                <w:b/>
+                <w:sz w:val="28"/>
+              </w:rPr>
+              <w:t>A1: Full (dual-path)</w:t>
+            </w:r>
+          </w:p>
+        </w:tc>
+        <w:tc>
+          <w:tcPr>
+            <w:tcW w:w="0" w:type="auto"/>
+          </w:tcPr>
+          <w:p>
+            <w:pPr>
+              <w:jc w:val="ctr"/>
+            </w:pPr>
+            <w:r>
+              <w:rPr>
+                <w:rFonts w:ascii="Times New Roman" w:hAnsi="Times New Roman"/>
+                <w:b/>
+                <w:sz w:val="28"/>
+              </w:rPr>
+              <w:t>0.9943</w:t>
+            </w:r>
+          </w:p>
+        </w:tc>
+        <w:tc>
+          <w:tcPr>
+            <w:tcW w:w="0" w:type="auto"/>
+          </w:tcPr>
+          <w:p>
+            <w:pPr>
+              <w:jc w:val="ctr"/>
+            </w:pPr>
+            <w:r>
+              <w:rPr>
+                <w:rFonts w:ascii="Times New Roman" w:hAnsi="Times New Roman"/>
+                <w:b/>
+                <w:sz w:val="28"/>
+              </w:rPr>
+              <w:t>96.7%</w:t>
+            </w:r>
+          </w:p>
+        </w:tc>
+        <w:tc>
+          <w:tcPr>
+            <w:tcW w:w="0" w:type="auto"/>
+          </w:tcPr>
+          <w:p>
+            <w:pPr>
+              <w:jc w:val="ctr"/>
+            </w:pPr>
+            <w:r>
+              <w:rPr>
+                <w:rFonts w:ascii="Times New Roman" w:hAnsi="Times New Roman"/>
+                <w:b/>
+                <w:sz w:val="28"/>
+              </w:rPr>
+              <w:t>0.978</w:t>
+            </w:r>
+          </w:p>
+        </w:tc>
+        <w:tc>
+          <w:tcPr>
+            <w:tcW w:w="0" w:type="auto"/>
+          </w:tcPr>
+          <w:p>
+            <w:pPr>
+              <w:jc w:val="ctr"/>
+            </w:pPr>
+            <w:r>
+              <w:rPr>
+                <w:rFonts w:ascii="Times New Roman" w:hAnsi="Times New Roman"/>
+                <w:b/>
+                <w:sz w:val="28"/>
+              </w:rPr>
+              <w:t>0.041</w:t>
+            </w:r>
+          </w:p>
+        </w:tc>
+        <w:tc>
+          <w:tcPr>
+            <w:tcW w:w="0" w:type="auto"/>
+          </w:tcPr>
+          <w:p>
+            <w:pPr>
+              <w:jc w:val="ctr"/>
+            </w:pPr>
+            <w:r>
+              <w:rPr>
+                <w:rFonts w:ascii="Times New Roman" w:hAnsi="Times New Roman"/>
+                <w:b/>
+                <w:sz w:val="28"/>
+              </w:rPr>
+              <w:t>28</w:t>
+            </w:r>
+          </w:p>
+        </w:tc>
+      </w:tr>
+      <w:tr>
+        <w:tc>
+          <w:tcPr>
+            <w:tcW w:w="0" w:type="auto"/>
+          </w:tcPr>
+          <w:p>
+            <w:r>
+              <w:rPr>
+                <w:rFonts w:ascii="Times New Roman" w:hAnsi="Times New Roman"/>
+                <w:sz w:val="28"/>
+              </w:rPr>
+              <w:t>A2: Spatial-only</w:t>
+            </w:r>
+          </w:p>
+        </w:tc>
+        <w:tc>
+          <w:tcPr>
+            <w:tcW w:w="0" w:type="auto"/>
+          </w:tcPr>
+          <w:p>
+            <w:pPr>
+              <w:jc w:val="ctr"/>
+            </w:pPr>
+            <w:r>
+              <w:rPr>
+                <w:rFonts w:ascii="Times New Roman" w:hAnsi="Times New Roman"/>
+                <w:sz w:val="28"/>
+              </w:rPr>
+              <w:t>0.9904</w:t>
+            </w:r>
+          </w:p>
+        </w:tc>
+        <w:tc>
+          <w:tcPr>
+            <w:tcW w:w="0" w:type="auto"/>
+          </w:tcPr>
+          <w:p>
+            <w:pPr>
+              <w:jc w:val="ctr"/>
+            </w:pPr>
+            <w:r>
+              <w:rPr>
+                <w:rFonts w:ascii="Times New Roman" w:hAnsi="Times New Roman"/>
+                <w:sz w:val="28"/>
+              </w:rPr>
+              <w:t>95.8%</w:t>
+            </w:r>
+          </w:p>
+        </w:tc>
+        <w:tc>
+          <w:tcPr>
+            <w:tcW w:w="0" w:type="auto"/>
+          </w:tcPr>
+          <w:p>
+            <w:pPr>
+              <w:jc w:val="ctr"/>
+            </w:pPr>
+            <w:r>
+              <w:rPr>
+                <w:rFonts w:ascii="Times New Roman" w:hAnsi="Times New Roman"/>
+                <w:sz w:val="28"/>
+              </w:rPr>
+              <w:t>0.971</w:t>
+            </w:r>
+          </w:p>
+        </w:tc>
+        <w:tc>
+          <w:tcPr>
+            <w:tcW w:w="0" w:type="auto"/>
+          </w:tcPr>
+          <w:p>
+            <w:pPr>
+              <w:jc w:val="ctr"/>
+            </w:pPr>
+            <w:r>
+              <w:rPr>
+                <w:rFonts w:ascii="Times New Roman" w:hAnsi="Times New Roman"/>
+                <w:sz w:val="28"/>
+              </w:rPr>
+              <w:t>0.047</w:t>
+            </w:r>
+          </w:p>
+        </w:tc>
+        <w:tc>
+          <w:tcPr>
+            <w:tcW w:w="0" w:type="auto"/>
+          </w:tcPr>
+          <w:p>
+            <w:pPr>
+              <w:jc w:val="ctr"/>
+            </w:pPr>
+            <w:r>
+              <w:rPr>
+                <w:rFonts w:ascii="Times New Roman" w:hAnsi="Times New Roman"/>
+                <w:sz w:val="28"/>
+              </w:rPr>
+              <w:t>19</w:t>
+            </w:r>
+          </w:p>
+        </w:tc>
+      </w:tr>
+      <w:tr>
+        <w:tc>
+          <w:tcPr>
+            <w:tcW w:w="0" w:type="auto"/>
+          </w:tcPr>
+          <w:p>
+            <w:r>
+              <w:rPr>
+                <w:rFonts w:ascii="Times New Roman" w:hAnsi="Times New Roman"/>
+                <w:sz w:val="28"/>
+              </w:rPr>
+              <w:t>A3: Temporal-only</w:t>
+            </w:r>
+          </w:p>
+        </w:tc>
+        <w:tc>
+          <w:tcPr>
+            <w:tcW w:w="0" w:type="auto"/>
+          </w:tcPr>
+          <w:p>
+            <w:pPr>
+              <w:jc w:val="ctr"/>
+            </w:pPr>
+            <w:r>
+              <w:rPr>
+                <w:rFonts w:ascii="Times New Roman" w:hAnsi="Times New Roman"/>
+                <w:sz w:val="28"/>
+              </w:rPr>
+              <w:t>0.9883</w:t>
+            </w:r>
+          </w:p>
+        </w:tc>
+        <w:tc>
+          <w:tcPr>
+            <w:tcW w:w="0" w:type="auto"/>
+          </w:tcPr>
+          <w:p>
+            <w:pPr>
+              <w:jc w:val="ctr"/>
+            </w:pPr>
+            <w:r>
+              <w:rPr>
+                <w:rFonts w:ascii="Times New Roman" w:hAnsi="Times New Roman"/>
+                <w:sz w:val="28"/>
+              </w:rPr>
+              <w:t>95.4%</w:t>
+            </w:r>
+          </w:p>
+        </w:tc>
+        <w:tc>
+          <w:tcPr>
+            <w:tcW w:w="0" w:type="auto"/>
+          </w:tcPr>
+          <w:p>
+            <w:pPr>
+              <w:jc w:val="ctr"/>
+            </w:pPr>
+            <w:r>
+              <w:rPr>
+                <w:rFonts w:ascii="Times New Roman" w:hAnsi="Times New Roman"/>
+                <w:sz w:val="28"/>
+              </w:rPr>
+              <w:t>0.969</w:t>
+            </w:r>
+          </w:p>
+        </w:tc>
+        <w:tc>
+          <w:tcPr>
+            <w:tcW w:w="0" w:type="auto"/>
+          </w:tcPr>
+          <w:p>
+            <w:pPr>
+              <w:jc w:val="ctr"/>
+            </w:pPr>
+            <w:r>
+              <w:rPr>
+                <w:rFonts w:ascii="Times New Roman" w:hAnsi="Times New Roman"/>
+                <w:sz w:val="28"/>
+              </w:rPr>
+              <w:t>0.046</w:t>
+            </w:r>
+          </w:p>
+        </w:tc>
+        <w:tc>
+          <w:tcPr>
+            <w:tcW w:w="0" w:type="auto"/>
+          </w:tcPr>
+          <w:p>
+            <w:pPr>
+              <w:jc w:val="ctr"/>
+            </w:pPr>
+            <w:r>
+              <w:rPr>
+                <w:rFonts w:ascii="Times New Roman" w:hAnsi="Times New Roman"/>
+                <w:sz w:val="28"/>
+              </w:rPr>
+              <w:t>24</w:t>
+            </w:r>
+          </w:p>
+        </w:tc>
+      </w:tr>
+      <w:tr>
+        <w:tc>
+          <w:tcPr>
+            <w:tcW w:w="0" w:type="auto"/>
+          </w:tcPr>
+          <w:p>
+            <w:r>
+              <w:rPr>
+                <w:rFonts w:ascii="Times New Roman" w:hAnsi="Times New Roman"/>
+                <w:sz w:val="28"/>
+              </w:rPr>
+              <w:t>A4: Sequential (BiLSTM)</w:t>
+            </w:r>
+          </w:p>
+        </w:tc>
+        <w:tc>
+          <w:tcPr>
+            <w:tcW w:w="0" w:type="auto"/>
+          </w:tcPr>
+          <w:p>
+            <w:pPr>
+              <w:jc w:val="ctr"/>
+            </w:pPr>
+            <w:r>
+              <w:rPr>
+                <w:rFonts w:ascii="Times New Roman" w:hAnsi="Times New Roman"/>
+                <w:sz w:val="28"/>
+              </w:rPr>
+              <w:t>0.9844</w:t>
+            </w:r>
+          </w:p>
+        </w:tc>
+        <w:tc>
+          <w:tcPr>
+            <w:tcW w:w="0" w:type="auto"/>
+          </w:tcPr>
+          <w:p>
+            <w:pPr>
+              <w:jc w:val="ctr"/>
+            </w:pPr>
+            <w:r>
+              <w:rPr>
+                <w:rFonts w:ascii="Times New Roman" w:hAnsi="Times New Roman"/>
+                <w:sz w:val="28"/>
+              </w:rPr>
+              <w:t>94.9%</w:t>
+            </w:r>
+          </w:p>
+        </w:tc>
+        <w:tc>
+          <w:tcPr>
+            <w:tcW w:w="0" w:type="auto"/>
+          </w:tcPr>
+          <w:p>
+            <w:pPr>
+              <w:jc w:val="ctr"/>
+            </w:pPr>
+            <w:r>
+              <w:rPr>
+                <w:rFonts w:ascii="Times New Roman" w:hAnsi="Times New Roman"/>
+                <w:sz w:val="28"/>
+              </w:rPr>
+              <w:t>0.966</w:t>
+            </w:r>
+          </w:p>
+        </w:tc>
+        <w:tc>
+          <w:tcPr>
+            <w:tcW w:w="0" w:type="auto"/>
+          </w:tcPr>
+          <w:p>
+            <w:pPr>
+              <w:jc w:val="ctr"/>
+            </w:pPr>
+            <w:r>
+              <w:rPr>
+                <w:rFonts w:ascii="Times New Roman" w:hAnsi="Times New Roman"/>
+                <w:sz w:val="28"/>
+              </w:rPr>
+              <w:t>0.057</w:t>
+            </w:r>
+          </w:p>
+        </w:tc>
+        <w:tc>
+          <w:tcPr>
+            <w:tcW w:w="0" w:type="auto"/>
+          </w:tcPr>
+          <w:p>
+            <w:pPr>
+              <w:jc w:val="ctr"/>
+            </w:pPr>
+            <w:r>
+              <w:rPr>
+                <w:rFonts w:ascii="Times New Roman" w:hAnsi="Times New Roman"/>
+                <w:sz w:val="28"/>
+              </w:rPr>
+              <w:t>11</w:t>
+            </w:r>
+          </w:p>
+        </w:tc>
+      </w:tr>
+    </w:tbl>
+    <w:p>
+      <w:pPr>
+        <w:ind w:firstLine="709"/>
+        <w:jc w:val="both"/>
+      </w:pPr>
+      <w:r>
+        <w:rPr>
+          <w:rFonts w:ascii="Times New Roman" w:hAnsi="Times New Roman"/>
+          <w:sz w:val="28"/>
+        </w:rPr>
+        <w:t xml:space="preserve">Увеличение длины входной последовательности с T=16 до T=32 при мультидатасетном обучении приводит к значительному повышению качества детектирования: AUC полной модели возрастает с 0.959 до 0.994 (+3.6%), а EER снижается с 0.121 до 0.041 (−66%). Ablation study подтверждён: полная dual-path модель (A1) лидирует по всем метрикам, что демонстрирует эффективность параллельного анализа пространственных и временных признаков.</w:t>
       </w:r>
     </w:p>
     <w:p>

</xml_diff>